<commit_message>
Finalize CA1 proposal V2 with references and supporting documents
</commit_message>
<xml_diff>
--- a/CA1-Credit-Default-Risk/2026328_AI_Declaration_AI_Fluency_Framework.docx
+++ b/CA1-Credit-Default-Risk/2026328_AI_Declaration_AI_Fluency_Framework.docx
@@ -23,6 +23,7 @@
         <w:jc w:val="center"/>
         <w:rPr>
           <w:rFonts w:ascii="Aptos" w:hAnsi="Aptos"/>
+          <w:lang w:val="mn-MN"/>
         </w:rPr>
       </w:pPr>
       <w:r>
@@ -42,8 +43,8 @@
         <w:tblLook w:val="04A0" w:firstRow="1" w:lastRow="0" w:firstColumn="1" w:lastColumn="0" w:noHBand="0" w:noVBand="1"/>
       </w:tblPr>
       <w:tblGrid>
-        <w:gridCol w:w="5040"/>
-        <w:gridCol w:w="5040"/>
+        <w:gridCol w:w="4953"/>
+        <w:gridCol w:w="4953"/>
       </w:tblGrid>
       <w:tr>
         <w:trPr>
@@ -594,24 +595,32 @@
           <w:bCs/>
           <w:sz w:val="22"/>
         </w:rPr>
+        <w:t>I also used AI to review the assignment requirements and identify areas that still needed improvement, such as references, the AI declaration and final GitHub checks.</w:t>
+      </w:r>
+      <w:r>
+        <w:rPr>
+          <w:rFonts w:ascii="Aptos" w:hAnsi="Aptos"/>
+          <w:bCs/>
+          <w:sz w:val="22"/>
+        </w:rPr>
+        <w:t xml:space="preserve"> </w:t>
+      </w:r>
+      <w:r>
+        <w:rPr>
+          <w:rFonts w:ascii="Aptos" w:hAnsi="Aptos"/>
+          <w:bCs/>
+          <w:sz w:val="22"/>
+        </w:rPr>
+        <w:t xml:space="preserve">For document presentation, I used AI to help prepare the cover page, suggest suitable font sizes, organize headings and improve the overall layout of the Word document. I used this support for formatting only and reviewed the final document </w:t>
+      </w:r>
+      <w:r>
+        <w:rPr>
+          <w:rFonts w:ascii="Aptos" w:hAnsi="Aptos"/>
+          <w:bCs/>
+          <w:sz w:val="22"/>
+        </w:rPr>
         <w:lastRenderedPageBreak/>
-        <w:t>I also used AI to review the assignment requirements and identify areas that still needed improvement, such as references, the AI declaration and final GitHub checks.</w:t>
-      </w:r>
-      <w:r>
-        <w:rPr>
-          <w:rFonts w:ascii="Aptos" w:hAnsi="Aptos"/>
-          <w:bCs/>
-          <w:sz w:val="22"/>
-        </w:rPr>
-        <w:t xml:space="preserve"> </w:t>
-      </w:r>
-      <w:r>
-        <w:rPr>
-          <w:rFonts w:ascii="Aptos" w:hAnsi="Aptos"/>
-          <w:bCs/>
-          <w:sz w:val="22"/>
-        </w:rPr>
-        <w:t>For document presentation, I used AI to help prepare the cover page, suggest suitable font sizes, organize headings and improve the overall layout of the Word document. I used this support for formatting only and reviewed the final document myself.</w:t>
+        <w:t>myself.</w:t>
       </w:r>
       <w:r>
         <w:rPr>
@@ -938,7 +947,6 @@
           <w:sz w:val="28"/>
           <w:szCs w:val="28"/>
         </w:rPr>
-        <w:lastRenderedPageBreak/>
         <w:t>Appendix A – AI prompt and output record</w:t>
       </w:r>
     </w:p>
@@ -968,7 +976,15 @@
           <w:rFonts w:ascii="Aptos" w:hAnsi="Aptos"/>
           <w:sz w:val="22"/>
         </w:rPr>
-        <w:t>After writing sections of the proposal myself, I used ChatGPT to check the English and clarity before preparing the final version. I also asked questions about some course topics and project-related concepts to make sure that I understood them correctly before using them in my report.</w:t>
+        <w:t xml:space="preserve">After writing sections of the proposal myself, I used ChatGPT to check the English and clarity </w:t>
+      </w:r>
+      <w:r>
+        <w:rPr>
+          <w:rFonts w:ascii="Aptos" w:hAnsi="Aptos"/>
+          <w:sz w:val="22"/>
+        </w:rPr>
+        <w:lastRenderedPageBreak/>
+        <w:t>before preparing the final version. I also asked questions about some course topics and project-related concepts to make sure that I understood them correctly before using them in my report.</w:t>
       </w:r>
     </w:p>
     <w:p>
@@ -1511,15 +1527,7 @@
           <w:rFonts w:ascii="Aptos" w:hAnsi="Aptos"/>
           <w:sz w:val="22"/>
         </w:rPr>
-        <w:t xml:space="preserve">AI also pointed out </w:t>
-      </w:r>
-      <w:r>
-        <w:rPr>
-          <w:rFonts w:ascii="Aptos" w:hAnsi="Aptos"/>
-          <w:sz w:val="22"/>
-        </w:rPr>
-        <w:lastRenderedPageBreak/>
-        <w:t>that the purpose is not only to reduce losses. A financial institution should also avoid treating reliable customers as high risk without good reason.</w:t>
+        <w:t>AI also pointed out that the purpose is not only to reduce losses. A financial institution should also avoid treating reliable customers as high risk without good reason.</w:t>
       </w:r>
     </w:p>
     <w:p>
@@ -1639,7 +1647,15 @@
           <w:rFonts w:ascii="Aptos" w:hAnsi="Aptos"/>
           <w:sz w:val="22"/>
         </w:rPr>
-        <w:t>The AI explained that if a customer who is actually high risk is predicted as low risk, the financial institution may take on more credit risk and could face financial losses if the customer defaults. It also explained that if a reliable customer is incorrectly predicted as high risk, the organisation may treat the customer too strictly and could lose a good customer or business opportunity.</w:t>
+        <w:t xml:space="preserve">The AI explained that if a customer who is actually high risk is predicted as low risk, the financial institution may take on more credit risk and could face financial losses if the </w:t>
+      </w:r>
+      <w:r>
+        <w:rPr>
+          <w:rFonts w:ascii="Aptos" w:hAnsi="Aptos"/>
+          <w:sz w:val="22"/>
+        </w:rPr>
+        <w:lastRenderedPageBreak/>
+        <w:t>customer defaults. It also explained that if a reliable customer is incorrectly predicted as high risk, the organisation may treat the customer too strictly and could lose a good customer or business opportunity.</w:t>
       </w:r>
     </w:p>
     <w:p>
@@ -2191,7 +2207,6 @@
           <w:color w:val="00B050"/>
           <w:sz w:val="22"/>
         </w:rPr>
-        <w:lastRenderedPageBreak/>
         <w:t>How I used:</w:t>
       </w:r>
       <w:r>
@@ -2228,17 +2243,7 @@
           <w:color w:val="EE0000"/>
           <w:sz w:val="22"/>
         </w:rPr>
-        <w:t>Prompt 9</w:t>
-      </w:r>
-      <w:r>
-        <w:rPr>
-          <w:rFonts w:ascii="Aptos" w:hAnsi="Aptos"/>
-          <w:b/>
-          <w:bCs/>
-          <w:color w:val="EE0000"/>
-          <w:sz w:val="22"/>
-        </w:rPr>
-        <w:t>:</w:t>
+        <w:t>Prompt 9:</w:t>
       </w:r>
       <w:r>
         <w:rPr>
@@ -2306,6 +2311,7 @@
           <w:color w:val="00B050"/>
           <w:sz w:val="22"/>
         </w:rPr>
+        <w:lastRenderedPageBreak/>
         <w:t>How I used:</w:t>
       </w:r>
       <w:r>
@@ -2370,17 +2376,65 @@
           <w:sz w:val="22"/>
         </w:rPr>
       </w:pPr>
-      <w:r>
-        <w:rPr>
-          <w:rFonts w:ascii="Aptos" w:hAnsi="Aptos"/>
-          <w:sz w:val="22"/>
-        </w:rPr>
-        <w:t>Student signature: ______________________________    Date: __________________</w:t>
+    </w:p>
+    <w:p>
+      <w:pPr>
+        <w:spacing w:after="160"/>
+        <w:rPr>
+          <w:rFonts w:ascii="Aptos" w:hAnsi="Aptos"/>
+          <w:sz w:val="22"/>
+        </w:rPr>
+      </w:pPr>
+      <w:r>
+        <w:rPr>
+          <w:rFonts w:ascii="Aptos" w:hAnsi="Aptos"/>
+          <w:b/>
+          <w:bCs/>
+          <w:sz w:val="22"/>
+        </w:rPr>
+        <w:t>Student signature:</w:t>
+      </w:r>
+      <w:r>
+        <w:rPr>
+          <w:rFonts w:ascii="Aptos" w:hAnsi="Aptos"/>
+          <w:sz w:val="22"/>
+        </w:rPr>
+        <w:t xml:space="preserve"> </w:t>
+      </w:r>
+      <w:r>
+        <w:rPr>
+          <w:rFonts w:ascii="Aptos" w:hAnsi="Aptos"/>
+          <w:sz w:val="22"/>
+        </w:rPr>
+        <w:t xml:space="preserve"> Dashzeveg Purevtogtokh                                         </w:t>
+      </w:r>
+      <w:r>
+        <w:rPr>
+          <w:rFonts w:ascii="Aptos" w:hAnsi="Aptos"/>
+          <w:sz w:val="22"/>
+        </w:rPr>
+        <w:t xml:space="preserve">    </w:t>
+      </w:r>
+      <w:r>
+        <w:rPr>
+          <w:rFonts w:ascii="Aptos" w:hAnsi="Aptos"/>
+          <w:b/>
+          <w:bCs/>
+          <w:sz w:val="22"/>
+        </w:rPr>
+        <w:t>Date:</w:t>
+      </w:r>
+      <w:r>
+        <w:rPr>
+          <w:rFonts w:ascii="Aptos" w:hAnsi="Aptos"/>
+          <w:sz w:val="22"/>
+        </w:rPr>
+        <w:t xml:space="preserve"> 10/15/2026</w:t>
       </w:r>
     </w:p>
     <w:sectPr>
       <w:footerReference w:type="default" r:id="rId8"/>
-      <w:pgSz w:w="12240" w:h="15840"/>
+      <w:pgSz w:w="11906" w:h="16838" w:code="9"/>
       <w:pgMar w:top="936" w:right="1080" w:bottom="936" w:left="1080" w:header="720" w:footer="720" w:gutter="0"/>
       <w:cols w:space="720"/>
       <w:docGrid w:linePitch="360"/>

</xml_diff>